<commit_message>
Clarify within-source contrasts and amendment chronology in concise CSPG4 draft
</commit_message>
<xml_diff>
--- a/research/release-candidates/cspg4-concise-20260922/journal-package/CSPG4-manuscript.docx
+++ b/research/release-candidates/cspg4-concise-20260922/journal-package/CSPG4-manuscript.docx
@@ -247,7 +247,7 @@
         <w:rPr>
           <w:b w:val="0"/>
         </w:rPr>
-        <w:t>This exploratory public-data reanalysis extends an earlier fixed 11-gene study.[4,6] We retained its specimen exclusions, gene panel and array-probe mappings. The broader comparison was specified on 19 September 2026 after the earlier findings were known. An amendment on 21 September added bootstrap uncertainty and a reference including intermediate tumors. The supplement records the analysis chronology and original protocol.</w:t>
+        <w:t>This exploratory public-data reanalysis extends an earlier fixed 11-gene study.[4,6] We retained its specimen exclusions, gene panel and array-probe mappings. The broader comparison was specified on 19 September 2026 after the earlier findings were known. An amendment on 21 September specified bootstrap uncertainty and a reference including intermediate tumors before their computation. The supplement records the analysis chronology and original protocol.</w:t>
       </w:r>
     </w:p>
     <w:p>
@@ -327,7 +327,7 @@
         <w:rPr>
           <w:b w:val="0"/>
         </w:rPr>
-        <w:t>Earlier comparator-specific and sequencing-year-conditioned analyses were retained as sensitivities. External summaries and pairwise A values were calculated within designated source strata; comparisons across sources required at least five profiles per diagnosis in each stratum. External measurements were not pooled, and no external P values were calculated. Code, source digests, selection ledgers and complete results accompany the data archive.</w:t>
+        <w:t>Earlier comparator-specific and sequencing-year-conditioned analyses were retained as sensitivities. External summaries and pairwise A values were calculated within designated source strata. Cross-source descriptive ranges included only within-source contrasts with at least five profiles per diagnosis in each contributing stratum. External measurements were not pooled, and no external P values were calculated. Code, source digests, selection ledgers and complete results accompany the data archive.</w:t>
       </w:r>
     </w:p>
     <w:p>

</xml_diff>

<commit_message>
Make concise CSPG4 manuscript self-contained and remove prior-version self references
</commit_message>
<xml_diff>
--- a/research/release-candidates/cspg4-concise-20260922/journal-package/CSPG4-manuscript.docx
+++ b/research/release-candidates/cspg4-concise-20260922/journal-package/CSPG4-manuscript.docx
@@ -111,7 +111,7 @@
           <w:b w:val="0"/>
           <w:sz w:val="22"/>
         </w:rPr>
-        <w:t xml:space="preserve"> An exploratory extension of a fixed 11-gene analysis compared nine EMC specimens with 393 other specimens from 28 source-defined malignant tumor categories in one RNA-sequencing cohort. All 644 eligible specimens, including other tumor categories, remained in the descriptive atlas. We used an exact rank-sum permutation test with Bonferroni correction for 11 genes, retained the original array comparisons, and characterized additional public collections separately by source and measurement scale.</w:t>
+        <w:t xml:space="preserve"> An exploratory analysis of a fixed 11-gene panel compared nine EMC specimens with 393 other specimens from 28 source-defined malignant tumor categories in one RNA-sequencing cohort. All 644 eligible specimens, including other tumor categories, remained in the descriptive atlas. We used an exact rank-sum permutation test with Bonferroni correction for 11 genes, evaluated the array comparisons, and characterized additional public collections separately by source and measurement scale.</w:t>
       </w:r>
     </w:p>
     <w:p>
@@ -215,7 +215,7 @@
         <w:rPr>
           <w:b w:val="0"/>
         </w:rPr>
-        <w:t>CSPG4 encodes a cell-surface proteoglycan studied across sarcomas. Boudin and colleagues described variation in its expression and associations with clinical and immune features in a large soft-tissue sarcoma collection.[2] An earlier fixed-panel analysis identified CSPG4 through comparisons of nine EMC specimens with myxoid liposarcoma, low-grade fibromyxoid sarcoma (LGFMS) and synovial sarcoma, with additional comparisons in an array cohort.[3,4,5]</w:t>
+        <w:t>CSPG4 encodes a cell-surface proteoglycan studied across sarcomas. Boudin and colleagues described variation in its expression and associations with clinical and immune features in a large soft-tissue sarcoma collection.[2] Public RNA-sequencing and array collections provide small EMC groups alongside other sarcoma types, allowing direct comparisons within each assay.[3,4]</w:t>
       </w:r>
     </w:p>
     <w:p>
@@ -223,7 +223,7 @@
         <w:rPr>
           <w:b w:val="0"/>
         </w:rPr>
-        <w:t>Here, we expand the same-source reference to eligible source-defined malignant categories and examine how the result changes when intermediate tumors are included. We also compare tumor types shared across RNA sequencing and arrays and describe CSPG4 expression in additional public collections. These analyses place the available EMC specimens within a wider RNA expression landscape and distinguish recurring differences from patterns that depend on the chosen reference.</w:t>
+        <w:t>Here, we compare EMC with eligible source-defined malignant categories and examine how the result changes when intermediate tumors are included. We also compare tumor types shared across RNA sequencing and arrays and describe CSPG4 expression in additional public collections. These analyses place the available EMC specimens within a wider RNA expression landscape and distinguish recurring differences from patterns that depend on the chosen reference.</w:t>
       </w:r>
     </w:p>
     <w:p>
@@ -247,7 +247,7 @@
         <w:rPr>
           <w:b w:val="0"/>
         </w:rPr>
-        <w:t>This exploratory public-data reanalysis extends an earlier fixed 11-gene study.[4,6] We retained its specimen exclusions, gene panel and array-probe mappings. The broader comparison was specified on 19 September 2026 after the earlier findings were known. An amendment on 21 September specified bootstrap uncertainty and a reference including intermediate tumors before their computation. The supplement records the analysis chronology and original protocol.</w:t>
+        <w:t>We evaluated CSPG4 within a fixed panel of 11 genes: CD276, SSTR2, PRAME, FAP, CD248, CSPG4, MSLN, L1CAM, GPC3, ALPP and CDH17. The broader reference and uncertainty analyses were specified after the initial comparator-specific results were known. Supplementary Information describes the analysis chronology, specimen exclusions, probe mappings and comparator-specific decision rule.</w:t>
       </w:r>
     </w:p>
     <w:p>
@@ -271,7 +271,7 @@
         <w:rPr>
           <w:b w:val="0"/>
         </w:rPr>
-        <w:t>GSE24369 provides six EMC biopsies, 17 LGFMS, six myxofibrosarcomas (MFS), six desmoids, five solitary fibrous tumors (SFT) and two pooled muscle RNAs.[5] We retained the released GPL6244 robust multi-array average log2 signals and CSPG4 transcript cluster 7990545. Lesion stage was not established. Comparisons were calculated within each dataset, keeping TPM and array signals separate.</w:t>
+        <w:t>GSE24369 provides six EMC biopsies, 17 low-grade fibromyxoid sarcomas (LGFMS), six myxofibrosarcomas (MFS), six desmoids, five solitary fibrous tumors (SFT) and two pooled muscle RNAs.[4] We retained the released GPL6244 robust multi-array average log2 signals and CSPG4 transcript cluster 7990545. Lesion stage was not established. Comparisons were calculated within each dataset, keeping TPM and array signals separate.</w:t>
       </w:r>
     </w:p>
     <w:p>
@@ -287,7 +287,7 @@
         <w:rPr>
           <w:b w:val="0"/>
         </w:rPr>
-        <w:t>The source search, completed on 19 September, examined public sarcoma compendia, their original accessions and identifiable EMC-containing studies. Records required a usable CSPG4 measurement and traceable diagnosis. We retained source-specific measurement scales: Treehouse Tumor Compendium 25.01 log2(TPM+1), Boudin et al. published normalized log2 values, GSE213065 Salmon TPM, GSE234092 featureCounts-derived counts per million (CPM), and OpenPedCan v15 gene TPM.[2,7,8,9,10] The supplement lists unresolved or inaccessible EMC sources.</w:t>
+        <w:t>The source search, completed on 19 September, examined public sarcoma compendia, their original accessions and identifiable EMC-containing studies. Records required a usable CSPG4 measurement and traceable diagnosis. We retained source-specific measurement scales: Treehouse Tumor Compendium 25.01 log2(TPM+1), Boudin et al. published normalized log2 values, GSE213065 Salmon TPM, GSE234092 featureCounts-derived counts per million (CPM), and OpenPedCan v15 gene TPM.[2,5,6,7,8] The supplement lists unresolved or inaccessible EMC sources.</w:t>
       </w:r>
     </w:p>
     <w:p>
@@ -319,7 +319,7 @@
         <w:rPr>
           <w:b w:val="0"/>
         </w:rPr>
-        <w:t>The primary test used the exact rank-sum distribution for every allocation of nine EMC labels among 402 observations, preserving ties. Its two-sided tail includes sums at least as far from the null expectation as the observed sum. This tests an exchangeable-label, common-distribution null for the observational groups. Bonferroni correction covers the retained 11 genes. Approximate 95% percentile bootstrap intervals for both references used 50,000 independent resamples of specimens within each group at its original size, seed 20260921, with linear-interpolation quantiles.[11] No new hypothesis test was added for the broader reference.</w:t>
+        <w:t>The primary test used the exact rank-sum distribution for every allocation of nine EMC labels among 402 observations, preserving ties. Its two-sided tail includes sums at least as far from the null expectation as the observed sum. This tests an exchangeable-label, common-distribution null for the observational groups. Bonferroni correction covers the retained 11 genes. Approximate 95% percentile bootstrap intervals for both references used 50,000 independent resamples of specimens within each group at its original size, seed 20260921, with linear-interpolation quantiles.[9] No new hypothesis test was added for the broader reference.</w:t>
       </w:r>
     </w:p>
     <w:p>
@@ -327,7 +327,7 @@
         <w:rPr>
           <w:b w:val="0"/>
         </w:rPr>
-        <w:t>Earlier comparator-specific and sequencing-year-conditioned analyses were retained as sensitivities. External summaries and pairwise A values were calculated within designated source strata. Cross-source descriptive ranges included only within-source contrasts with at least five profiles per diagnosis in each contributing stratum. External measurements were not pooled, and no external P values were calculated. Code, source digests, selection ledgers and complete results accompany the data archive.</w:t>
+        <w:t>Comparator-specific and sequencing-year-conditioned analyses were evaluated as sensitivities. External summaries and pairwise A values were calculated within designated source strata. Cross-source descriptive ranges included only within-source contrasts with at least five profiles per diagnosis in each contributing stratum. External measurements were not pooled, and no external P values were calculated. Code, source digests, selection ledgers and complete results accompany the data archive.</w:t>
       </w:r>
     </w:p>
     <w:p>
@@ -455,7 +455,7 @@
         <w:rPr>
           <w:b w:val="0"/>
         </w:rPr>
-        <w:t>The nine EMC specimens remain the main limit on precision, reflected in the wide bootstrap intervals. Small comparison groups also make median rankings uncertain. The references reflect source classifications and sampling rather than population incidence or a comprehensive clinical taxonomy. Equal-category estimates change the weights but retain this dependence. This exploratory extension followed the identification of CSPG4 as a gene of interest. Correction for 11 genes addresses that family of tests; retrospective selection and unmeasured confounding remain outside both that correction and the approximate bootstrap intervals.</w:t>
+        <w:t>The nine EMC specimens remain the main limit on precision, reflected in the wide bootstrap intervals. Small comparison groups also make median rankings uncertain. The references reflect source classifications and sampling rather than population incidence or a comprehensive clinical taxonomy. Equal-category estimates change the weights but retain this dependence. The broader exploratory comparison followed the identification of CSPG4 as a gene of interest. Correction for 11 genes addresses that family of tests; retrospective selection and unmeasured confounding remain outside both that correction and the approximate bootstrap intervals.</w:t>
       </w:r>
     </w:p>
     <w:p>
@@ -498,7 +498,7 @@
         <w:rPr>
           <w:b w:val="0"/>
         </w:rPr>
-        <w:t xml:space="preserve"> The original Hofvander data are available through https://doi.org/10.5281/zenodo.17866629. Original array data and annotations are available as GEO GSE24369 and GPL6244. Additional inputs are Treehouse Tumor Compendium 25.01, Boudin et al. Supplementary Table S8, GEO GSE213065 and GSE234092, and OpenPedCan v15. The revision’s data and code package, including exact source URLs, selection ledgers, digests and specimen values, is available at https://github.com/trimcrae/Rare-cancers/blob/1f9f087e2dd666f721bed6c20b8b64d72203c12e/research/release-candidates/cspg4-presubmission-20260921/CSPG4-data-code.zip. The original reproducibility archive remains at https://assets-eu.researchsquare.com/files/rs-10959636/v1/b95606f3a3799c60c8ac4434.zip. That historical archive does not contain the new expanded analyses. Source-specific attribution and reuse terms continue to apply.</w:t>
+        <w:t xml:space="preserve"> The original Hofvander data are available through https://doi.org/10.5281/zenodo.17866629. Original array data and annotations are available as GEO GSE24369 and GPL6244. Additional inputs are Treehouse Tumor Compendium 25.01, Boudin et al. Supplementary Table S8, GEO GSE213065 and GSE234092, and OpenPedCan v15. The data and code package, including exact source URLs, selection ledgers, digests and specimen values, is available at https://github.com/trimcrae/Rare-cancers/blob/14fea9109d7f329fe9319f1af58560707c938027/research/release-candidates/cspg4-concise-20260922/journal-package/CSPG4-data-code.zip. Source-specific attribution and reuse terms continue to apply.</w:t>
       </w:r>
     </w:p>
     <w:p>
@@ -649,7 +649,7 @@
           <w:b w:val="0"/>
           <w:sz w:val="21"/>
         </w:rPr>
-        <w:t>[4] McRae TD. Fixed-panel tissue RNA prioritization in extraskeletal myxoid chondrosarcoma: CSPG4 evidence across cohorts with comparator and sequencing-year limits. Research Square. 2026. Version 1 and accompanying code/data supplement. https://doi.org/10.21203/rs.3.rs-10959636/v1.</w:t>
+        <w:t>[4] National Center for Biotechnology Information. GEO series GSE24369 and platform GPL6244. https://www.ncbi.nlm.nih.gov/geo/query/acc.cgi?acc=GSE24369; https://www.ncbi.nlm.nih.gov/geo/query/acc.cgi?acc=GPL6244.</w:t>
       </w:r>
     </w:p>
     <w:p>
@@ -661,7 +661,7 @@
           <w:b w:val="0"/>
           <w:sz w:val="21"/>
         </w:rPr>
-        <w:t>[5] National Center for Biotechnology Information. GEO series GSE24369 and platform GPL6244. https://www.ncbi.nlm.nih.gov/geo/query/acc.cgi?acc=GSE24369; https://www.ncbi.nlm.nih.gov/geo/query/acc.cgi?acc=GPL6244.</w:t>
+        <w:t>[5] Beale HC, Learned K, Kephart ET, et al. Consistently processed RNA sequencing data from 50 sources enriched for pediatric data. Sci Data. 2025;12:1134. https://doi.org/10.1038/s41597-025-05376-z.</w:t>
       </w:r>
     </w:p>
     <w:p>
@@ -673,7 +673,7 @@
           <w:b w:val="0"/>
           <w:sz w:val="21"/>
         </w:rPr>
-        <w:t>[6] McRae TD. EMC research program expression-panel definitions. Pinned revision 81d2931733aae640220c042039d0c53efed1690a. https://github.com/trimcrae/Rare-cancers/blob/81d2931733aae640220c042039d0c53efed1690a/research/modalities/emc_expression_panels.py.</w:t>
+        <w:t>[6] Subramanian A, Nemat-Gorgani N, Ellis-Caleo TJ, et al. Sarcoma microenvironment cell states and ecosystems are associated with prognosis and predict response to immunotherapy. Nat Cancer. 2024;5:642–658. https://doi.org/10.1038/s43018-024-00743-y.</w:t>
       </w:r>
     </w:p>
     <w:p>
@@ -685,7 +685,7 @@
           <w:b w:val="0"/>
           <w:sz w:val="21"/>
         </w:rPr>
-        <w:t>[7] Beale HC, Learned K, Kephart ET, et al. Consistently processed RNA sequencing data from 50 sources enriched for pediatric data. Sci Data. 2025;12:1134. https://doi.org/10.1038/s41597-025-05376-z.</w:t>
+        <w:t>[7] Seligson ND, Asmann YW, Almerey T, et al. Molecular markers of proliferation, DNA repair, and immune infiltration defines high-risk subset of resectable retroperitoneal sarcomas. Surg Oncol. 2024;56:102125. https://doi.org/10.1016/j.suronc.2024.102125.</w:t>
       </w:r>
     </w:p>
     <w:p>
@@ -697,7 +697,7 @@
           <w:b w:val="0"/>
           <w:sz w:val="21"/>
         </w:rPr>
-        <w:t>[8] Subramanian A, Nemat-Gorgani N, Ellis-Caleo TJ, et al. Sarcoma microenvironment cell states and ecosystems are associated with prognosis and predict response to immunotherapy. Nat Cancer. 2024;5:642–658. https://doi.org/10.1038/s43018-024-00743-y.</w:t>
+        <w:t>[8] Geng Z, Wafula E, Corbett RJ, et al. The Open Pediatric Cancer Project. GigaScience. 2025;14:giaf093. https://doi.org/10.1093/gigascience/giaf093.</w:t>
       </w:r>
     </w:p>
     <w:p>
@@ -709,31 +709,7 @@
           <w:b w:val="0"/>
           <w:sz w:val="21"/>
         </w:rPr>
-        <w:t>[9] Seligson ND, Asmann YW, Almerey T, et al. Molecular markers of proliferation, DNA repair, and immune infiltration defines high-risk subset of resectable retroperitoneal sarcomas. Surg Oncol. 2024;56:102125. https://doi.org/10.1016/j.suronc.2024.102125.</w:t>
-      </w:r>
-    </w:p>
-    <w:p>
-      <w:pPr>
-        <w:spacing w:line="252" w:lineRule="auto" w:after="140"/>
-      </w:pPr>
-      <w:r>
-        <w:rPr>
-          <w:b w:val="0"/>
-          <w:sz w:val="21"/>
-        </w:rPr>
-        <w:t>[10] Geng Z, Wafula E, Corbett RJ, et al. The Open Pediatric Cancer Project. GigaScience. 2025;14:giaf093. https://doi.org/10.1093/gigascience/giaf093.</w:t>
-      </w:r>
-    </w:p>
-    <w:p>
-      <w:pPr>
-        <w:spacing w:line="252" w:lineRule="auto" w:after="140"/>
-      </w:pPr>
-      <w:r>
-        <w:rPr>
-          <w:b w:val="0"/>
-          <w:sz w:val="21"/>
-        </w:rPr>
-        <w:t>[11] Efron B. Bootstrap methods: another look at the jackknife. Ann Statist. 1979;7:1–26. https://doi.org/10.1214/aos/1176344552.</w:t>
+        <w:t>[9] Efron B. Bootstrap methods: another look at the jackknife. Ann Statist. 1979;7:1–26. https://doi.org/10.1214/aos/1176344552.</w:t>
       </w:r>
     </w:p>
     <w:p>

</xml_diff>

<commit_message>
Explain CSPG4 panel rationale and established cancer biology and targeting context
</commit_message>
<xml_diff>
--- a/research/release-candidates/cspg4-concise-20260922/journal-package/CSPG4-manuscript.docx
+++ b/research/release-candidates/cspg4-concise-20260922/journal-package/CSPG4-manuscript.docx
@@ -86,7 +86,7 @@
           <w:b w:val="0"/>
           <w:sz w:val="22"/>
         </w:rPr>
-        <w:t xml:space="preserve"> Extraskeletal myxoid chondrosarcoma (EMC) is a rare soft-tissue sarcoma. Chondroitin sulfate proteoglycan 4 (CSPG4) is a cell-surface protein whose expression has been studied across sarcoma types. We examined where EMC lies within a broader tissue RNA landscape and whether its differences from named sarcomas recur across datasets.</w:t>
+        <w:t xml:space="preserve"> Extraskeletal myxoid chondrosarcoma (EMC) is a rare soft-tissue sarcoma. Chondroitin sulfate proteoglycan 4 (CSPG4) is a cell-surface protein whose expression has been studied across sarcoma types. This study examined where EMC lies within a broader tissue RNA landscape and whether its differences from named sarcomas recur across datasets.</w:t>
       </w:r>
     </w:p>
     <w:p>
@@ -111,7 +111,7 @@
           <w:b w:val="0"/>
           <w:sz w:val="22"/>
         </w:rPr>
-        <w:t xml:space="preserve"> An exploratory analysis of a fixed 11-gene panel compared nine EMC specimens with 393 other specimens from 28 source-defined malignant tumor categories in one RNA-sequencing cohort. All 644 eligible specimens, including other tumor categories, remained in the descriptive atlas. We used an exact rank-sum permutation test with Bonferroni correction for 11 genes, evaluated the array comparisons, and characterized additional public collections separately by source and measurement scale.</w:t>
+        <w:t xml:space="preserve"> An exploratory analysis of a fixed 11-gene panel compared nine EMC specimens with 393 other specimens from 28 source-defined malignant tumor categories in one RNA-sequencing cohort. All 644 eligible specimens, including other tumor categories, remained in the descriptive atlas. Analysis used an exact rank-sum permutation test with Bonferroni correction for 11 genes, evaluated the array comparisons, and characterized additional public collections separately by source and measurement scale.</w:t>
       </w:r>
     </w:p>
     <w:p>
@@ -207,7 +207,7 @@
         <w:rPr>
           <w:b w:val="0"/>
         </w:rPr>
-        <w:t>Extraskeletal myxoid chondrosarcoma (EMC) is a rare soft-tissue sarcoma characteristically associated with NR4A3 rearrangements.[1] Public expression studies contain few EMC specimens, so comparisons often rely on a small selection of other sarcomas. A difference observed in those comparisons leaves an important question: where does EMC lie within the broader range of tumor types?</w:t>
+        <w:t>Extraskeletal myxoid chondrosarcoma (EMC) is a rare soft-tissue sarcoma characteristically associated with NR4A3 rearrangements.[1] Public expression studies contain few EMC specimens, making it difficult to place candidate antigens in the context of other sarcomas.</w:t>
       </w:r>
     </w:p>
     <w:p>
@@ -215,7 +215,7 @@
         <w:rPr>
           <w:b w:val="0"/>
         </w:rPr>
-        <w:t>CSPG4 encodes a cell-surface proteoglycan studied across sarcomas. Boudin and colleagues described variation in its expression and associations with clinical and immune features in a large soft-tissue sarcoma collection.[2] Public RNA-sequencing and array collections provide small EMC groups alongside other sarcoma types, allowing direct comparisons within each assay.[3,4]</w:t>
+        <w:t>The initial analysis compared RNA expression of 11 genes encoding candidate therapeutic antigens in EMC and selected sarcoma comparators. CSPG4 alone met the fixed prioritization rule across myxoid liposarcoma, low-grade fibromyxoid sarcoma and synovial sarcoma. Its higher expression relative to low-grade fibromyxoid sarcoma also recurred in a separate array collection. These findings motivated the broader question addressed here: where does EMC lie within the range of CSPG4 expression across sarcoma types?</w:t>
       </w:r>
     </w:p>
     <w:p>
@@ -223,7 +223,15 @@
         <w:rPr>
           <w:b w:val="0"/>
         </w:rPr>
-        <w:t>Here, we compare EMC with eligible source-defined malignant categories and examine how the result changes when intermediate tumors are included. We also compare tumor types shared across RNA sequencing and arrays and describe CSPG4 expression in additional public collections. These analyses place the available EMC specimens within a wider RNA expression landscape and distinguish recurring differences from patterns that depend on the chosen reference.</w:t>
+        <w:t>CSPG4 encodes a cell-surface proteoglycan, also known as NG2, with an established role in experimental cancer biology. In melanoma cells, CSPG4 enhances integrin-dependent cell spreading and activation of focal adhesion kinase (FAK) and ERK1/2 signaling.[2] Boudin and colleagues described heterogeneous CSPG4 expression and associations with prognosis and immune features across soft-tissue sarcomas.[3] This provides a biological context for examining the small EMC groups available in public RNA-sequencing and array collections.[4,5]</w:t>
+      </w:r>
+    </w:p>
+    <w:p>
+      <w:r>
+        <w:rPr>
+          <w:b w:val="0"/>
+        </w:rPr>
+        <w:t>The present study compares EMC with a broader sarcoma reference, examines contrasts shared across assays and describes additional public collections separately by source. Together, these analyses show which expression differences recur and which depend on the chosen comparator.</w:t>
       </w:r>
     </w:p>
     <w:p>
@@ -247,7 +255,7 @@
         <w:rPr>
           <w:b w:val="0"/>
         </w:rPr>
-        <w:t>We evaluated CSPG4 within a fixed panel of 11 genes: CD276, SSTR2, PRAME, FAP, CD248, CSPG4, MSLN, L1CAM, GPC3, ALPP and CDH17. The broader reference and uncertainty analyses were specified after the initial comparator-specific results were known. Supplementary Information describes the analysis chronology, specimen exclusions, probe mappings and comparator-specific decision rule.</w:t>
+        <w:t>CSPG4 was evaluated within a fixed panel of 11 genes: CD276, SSTR2, PRAME, FAP, CD248, CSPG4, MSLN, L1CAM, GPC3, ALPP and CDH17. The broader reference and uncertainty analyses were specified after the initial comparator-specific results were known. Supplementary Information describes the analysis chronology, specimen exclusions, probe mappings and comparator-specific decision rule.</w:t>
       </w:r>
     </w:p>
     <w:p>
@@ -255,7 +263,7 @@
         <w:rPr>
           <w:b w:val="0"/>
         </w:rPr>
-        <w:t>The Hofvander collection provides gene-level transcripts per million (TPM), original diagnoses and specimen metadata.[3] We used the original diagnoses and excluded specimens with a nonblank recurrence or metastasis flag. Of 13 source EMC specimens, three previously reported cases and one local recurrence were excluded, leaving nine. Source Table S1 marked all nine as fusion-positive. Filtered fusion records specify seven NR4A3 fusions, one RT-PCR-verified FUS::NR4A2 fusion and no crosswalked fusion for the remaining specimen (Table S6). Membership follows the source EMC diagnosis.</w:t>
+        <w:t>The Hofvander collection provides gene-level transcripts per million (TPM), original diagnoses and specimen metadata.[4] Eligibility followed the original diagnoses and excluded specimens with a nonblank recurrence or metastasis flag. Of 13 source EMC specimens, three previously reported cases and one local recurrence were excluded, leaving nine. Source Table S1 marked all nine as fusion-positive. Filtered fusion records specify seven NR4A3 fusions, one RT-PCR-verified FUS::NR4A2 fusion and no crosswalked fusion for the remaining specimen (Table S6). Membership follows the source EMC diagnosis.</w:t>
       </w:r>
     </w:p>
     <w:p>
@@ -271,7 +279,7 @@
         <w:rPr>
           <w:b w:val="0"/>
         </w:rPr>
-        <w:t>GSE24369 provides six EMC biopsies, 17 low-grade fibromyxoid sarcomas (LGFMS), six myxofibrosarcomas (MFS), six desmoids, five solitary fibrous tumors (SFT) and two pooled muscle RNAs.[4] We retained the released GPL6244 robust multi-array average log2 signals and CSPG4 transcript cluster 7990545. Lesion stage was not established. Comparisons were calculated within each dataset, keeping TPM and array signals separate.</w:t>
+        <w:t>GSE24369 provides six EMC biopsies, 17 low-grade fibromyxoid sarcomas (LGFMS), six myxofibrosarcomas (MFS), six desmoids, five solitary fibrous tumors (SFT) and two pooled muscle RNAs.[5] Array analysis retained the released GPL6244 robust multi-array average log2 signals and CSPG4 transcript cluster 7990545. Lesion stage was not established. Comparisons were calculated within each dataset, keeping TPM and array signals separate.</w:t>
       </w:r>
     </w:p>
     <w:p>
@@ -287,7 +295,7 @@
         <w:rPr>
           <w:b w:val="0"/>
         </w:rPr>
-        <w:t>The source search, completed on 19 September, examined public sarcoma compendia, their original accessions and identifiable EMC-containing studies. Records required a usable CSPG4 measurement and traceable diagnosis. We retained source-specific measurement scales: Treehouse Tumor Compendium 25.01 log2(TPM+1), Boudin et al. published normalized log2 values, GSE213065 Salmon TPM, GSE234092 featureCounts-derived counts per million (CPM), and OpenPedCan v15 gene TPM.[2,5,6,7,8] The supplement lists unresolved or inaccessible EMC sources.</w:t>
+        <w:t>The source search, completed on 19 September, examined public sarcoma compendia, their original accessions and identifiable EMC-containing studies. Records required a usable CSPG4 measurement and traceable diagnosis. Each collection retained its source-specific measurement scale: Treehouse Tumor Compendium 25.01 log2(TPM+1), Boudin et al. published normalized log2 values, GSE213065 Salmon TPM, GSE234092 featureCounts-derived counts per million (CPM), and OpenPedCan v15 gene TPM.[3,6,7,8,9] The supplement lists unresolved or inaccessible EMC sources.</w:t>
       </w:r>
     </w:p>
     <w:p>
@@ -311,7 +319,7 @@
         <w:rPr>
           <w:b w:val="0"/>
         </w:rPr>
-        <w:t>We summarized expression by median, quartiles and range. The comparison score A=P(EMC&gt;reference)+0.5P(tie) averages all specimen pairs; A=0.5 denotes neutral ordering. The primary estimate weights reference specimens equally. We also averaged the category-specific scores to give each reference category equal weight and examined deletion of individual EMC specimens.</w:t>
+        <w:t>Expression summaries included medians, quartiles and ranges. The comparison score A=P(EMC&gt;reference)+0.5P(tie) averages all specimen pairs; A=0.5 denotes neutral ordering. The primary estimate weights reference specimens equally. Sensitivity analyses averaged the category-specific scores to give each reference category equal weight and examined deletion of individual EMC specimens.</w:t>
       </w:r>
     </w:p>
     <w:p>
@@ -319,7 +327,7 @@
         <w:rPr>
           <w:b w:val="0"/>
         </w:rPr>
-        <w:t>The primary test used the exact rank-sum distribution for every allocation of nine EMC labels among 402 observations, preserving ties. Its two-sided tail includes sums at least as far from the null expectation as the observed sum. This tests an exchangeable-label, common-distribution null for the observational groups. Bonferroni correction covers the retained 11 genes. Approximate 95% percentile bootstrap intervals for both references used 50,000 independent resamples of specimens within each group at its original size, seed 20260921, with linear-interpolation quantiles.[9] No new hypothesis test was added for the broader reference.</w:t>
+        <w:t>The primary test used the exact rank-sum distribution for every allocation of nine EMC labels among 402 observations, preserving ties. Its two-sided tail includes sums at least as far from the null expectation as the observed sum. This tests an exchangeable-label, common-distribution null for the observational groups. Bonferroni correction covers the retained 11 genes. Approximate 95% percentile bootstrap intervals for both references used 50,000 independent resamples of specimens within each group at its original size, seed 20260921, with linear-interpolation quantiles.[10] No new hypothesis test was added for the broader reference.</w:t>
       </w:r>
     </w:p>
     <w:p>
@@ -439,7 +447,7 @@
         <w:rPr>
           <w:b w:val="0"/>
         </w:rPr>
-        <w:t>EMC lay toward the higher end of CSPG4 RNA expression in both the primary malignant reference and the broader reference including intermediate tumors. Four named contrasts recurred across RNA sequencing and arrays. GIST and DFSP nevertheless had slightly higher observed medians than EMC, and several benign categories also had high expression. The findings describe a comparative pattern with substantial overlap and dependence on the chosen reference.</w:t>
+        <w:t>EMC lay toward the higher end of CSPG4 RNA expression in both the primary malignant reference and the broader reference including intermediate tumors. Four named contrasts recurred across RNA sequencing and arrays. The slightly higher medians in GIST and DFSP show that elevated CSPG4 RNA extends across distinct mesenchymal tumor types. These groups provide useful comparators for subsequent EMC tissue studies, while the high values in some benign categories make cellular localization particularly important. Similar bulk expression does not establish a shared biological driver.</w:t>
       </w:r>
     </w:p>
     <w:p>
@@ -447,7 +455,15 @@
         <w:rPr>
           <w:b w:val="0"/>
         </w:rPr>
-        <w:t>Boudin et al. established broad CSPG4 heterogeneity and prognostic and immune associations across soft-tissue sarcomas.[2] This study adds the explicit placement of a rare histology and a paired view of the available direct EMC comparisons. The additional public collections broadened histologic coverage and showed both recurring and divergent relative patterns. They supplied no further explicitly labeled EMC group, leaving independent replication of the EMC comparison unresolved.</w:t>
+        <w:t>CSPG4 is already being investigated as a therapeutic target. A CSPG4-directed antibody inhibited tumor growth and metastasis in mouse models of triple-negative breast cancer.[11] In sarcoma models, cytokine-induced killer cells carrying a CSPG4-directed chimeric antigen receptor (CAR) showed activity in culture and in xenografts of leiomyosarcoma, undifferentiated pleomorphic sarcoma and fibrosarcoma.[12] A CSPG4-directed CAR-T approach has also entered phase I testing in recurrent or refractory head-and-neck squamous-cell carcinoma (NCT06096038), with safety and tolerability as the primary objective.[13] These studies place the EMC expression finding within an existing experimental targeting field, without establishing a treatment for EMC.</w:t>
+      </w:r>
+    </w:p>
+    <w:p>
+      <w:r>
+        <w:rPr>
+          <w:b w:val="0"/>
+        </w:rPr>
+        <w:t>The contribution here is the explicit placement of EMC within the wider CSPG4 RNA distribution. The additional collections show both recurring and divergent relationships among other sarcomas, consistent with the heterogeneity reported by Boudin et al.[3] They supplied no further explicitly labeled EMC group, leaving independent replication of the EMC comparison unresolved.</w:t>
       </w:r>
     </w:p>
     <w:p>
@@ -471,7 +487,7 @@
         <w:rPr>
           <w:b w:val="0"/>
         </w:rPr>
-        <w:t>Finally, bulk RNA measures contributions from malignant and nonmalignant cells. Purity estimates were unavailable for all nine EMC specimens, and normal tissues were not matched to tumors. These data leave malignant-cell localization, accessible CSPG4 protein and normal-tissue sparing unresolved. Expression ordering alone cannot establish a diagnostic threshold, therapeutic window or treatment benefit. The study provides a broader RNA comparison and a reproducible reference resource for tissue studies and independently sampled EMC cohorts.</w:t>
+        <w:t>Finally, bulk RNA measures contributions from malignant and nonmalignant cells. Purity estimates were unavailable for all nine EMC specimens, and normal tissues were not matched to tumors. These data leave malignant-cell localization, accessible CSPG4 protein and normal-tissue sparing unresolved. Expression ordering alone cannot establish a diagnostic threshold, therapeutic window or treatment benefit. The next step is to establish CSPG4 protein abundance and cellular localization in EMC, including its accessibility on malignant cells. That would connect the RNA finding to the biological and targeting questions already being studied in other cancers.</w:t>
       </w:r>
     </w:p>
     <w:p>
@@ -625,7 +641,7 @@
           <w:b w:val="0"/>
           <w:sz w:val="21"/>
         </w:rPr>
-        <w:t>[2] Boudin L, de Nonneville A, Finetti P, Mescam L, Le Cesne A, Italiano A, et al. CSPG4 expression in soft tissue sarcomas is associated with poor prognosis and low cytotoxic immune response. J Transl Med. 2022;20:464. https://doi.org/10.1186/s12967-022-03679-y.</w:t>
+        <w:t>[2] Yang J, Price MA, Neudauer CL, Wilson C, Ferrone S, Xia H, et al. Melanoma chondroitin sulfate proteoglycan enhances FAK and ERK activation by distinct mechanisms. J Cell Biol. 2004;165:881–891. https://doi.org/10.1083/jcb.200403174.</w:t>
       </w:r>
     </w:p>
     <w:p>
@@ -637,7 +653,7 @@
           <w:b w:val="0"/>
           <w:sz w:val="21"/>
         </w:rPr>
-        <w:t>[3] Hofvander J, Köster J, Sydow S, Piccinelli P, Vult von Steyern F, Tsagkozis P, et al. Transcriptomic Subgroups in Soft Tissue Tumors Correlate with Morphologic Subtype, Genomic Features, and Outcome. Clin Cancer Res. 2026;32:1825–1834. https://doi.org/10.1158/1078-0432.CCR-25-3740.</w:t>
+        <w:t>[3] Boudin L, de Nonneville A, Finetti P, Mescam L, Le Cesne A, Italiano A, et al. CSPG4 expression in soft tissue sarcomas is associated with poor prognosis and low cytotoxic immune response. J Transl Med. 2022;20:464. https://doi.org/10.1186/s12967-022-03679-y.</w:t>
       </w:r>
     </w:p>
     <w:p>
@@ -649,7 +665,7 @@
           <w:b w:val="0"/>
           <w:sz w:val="21"/>
         </w:rPr>
-        <w:t>[4] National Center for Biotechnology Information. GEO series GSE24369 and platform GPL6244. https://www.ncbi.nlm.nih.gov/geo/query/acc.cgi?acc=GSE24369; https://www.ncbi.nlm.nih.gov/geo/query/acc.cgi?acc=GPL6244.</w:t>
+        <w:t>[4] Hofvander J, Köster J, Sydow S, Piccinelli P, Vult von Steyern F, Tsagkozis P, et al. Transcriptomic Subgroups in Soft Tissue Tumors Correlate with Morphologic Subtype, Genomic Features, and Outcome. Clin Cancer Res. 2026;32:1825–1834. https://doi.org/10.1158/1078-0432.CCR-25-3740.</w:t>
       </w:r>
     </w:p>
     <w:p>
@@ -661,7 +677,7 @@
           <w:b w:val="0"/>
           <w:sz w:val="21"/>
         </w:rPr>
-        <w:t>[5] Beale HC, Learned K, Kephart ET, et al. Consistently processed RNA sequencing data from 50 sources enriched for pediatric data. Sci Data. 2025;12:1134. https://doi.org/10.1038/s41597-025-05376-z.</w:t>
+        <w:t>[5] National Center for Biotechnology Information. GEO series GSE24369 and platform GPL6244. https://www.ncbi.nlm.nih.gov/geo/query/acc.cgi?acc=GSE24369; https://www.ncbi.nlm.nih.gov/geo/query/acc.cgi?acc=GPL6244.</w:t>
       </w:r>
     </w:p>
     <w:p>
@@ -673,7 +689,7 @@
           <w:b w:val="0"/>
           <w:sz w:val="21"/>
         </w:rPr>
-        <w:t>[6] Subramanian A, Nemat-Gorgani N, Ellis-Caleo TJ, et al. Sarcoma microenvironment cell states and ecosystems are associated with prognosis and predict response to immunotherapy. Nat Cancer. 2024;5:642–658. https://doi.org/10.1038/s43018-024-00743-y.</w:t>
+        <w:t>[6] Beale HC, Learned K, Kephart ET, et al. Consistently processed RNA sequencing data from 50 sources enriched for pediatric data. Sci Data. 2025;12:1134. https://doi.org/10.1038/s41597-025-05376-z.</w:t>
       </w:r>
     </w:p>
     <w:p>
@@ -685,7 +701,7 @@
           <w:b w:val="0"/>
           <w:sz w:val="21"/>
         </w:rPr>
-        <w:t>[7] Seligson ND, Asmann YW, Almerey T, et al. Molecular markers of proliferation, DNA repair, and immune infiltration defines high-risk subset of resectable retroperitoneal sarcomas. Surg Oncol. 2024;56:102125. https://doi.org/10.1016/j.suronc.2024.102125.</w:t>
+        <w:t>[7] Subramanian A, Nemat-Gorgani N, Ellis-Caleo TJ, et al. Sarcoma microenvironment cell states and ecosystems are associated with prognosis and predict response to immunotherapy. Nat Cancer. 2024;5:642–658. https://doi.org/10.1038/s43018-024-00743-y.</w:t>
       </w:r>
     </w:p>
     <w:p>
@@ -697,7 +713,7 @@
           <w:b w:val="0"/>
           <w:sz w:val="21"/>
         </w:rPr>
-        <w:t>[8] Geng Z, Wafula E, Corbett RJ, et al. The Open Pediatric Cancer Project. GigaScience. 2025;14:giaf093. https://doi.org/10.1093/gigascience/giaf093.</w:t>
+        <w:t>[8] Seligson ND, Asmann YW, Almerey T, et al. Molecular markers of proliferation, DNA repair, and immune infiltration defines high-risk subset of resectable retroperitoneal sarcomas. Surg Oncol. 2024;56:102125. https://doi.org/10.1016/j.suronc.2024.102125.</w:t>
       </w:r>
     </w:p>
     <w:p>
@@ -709,7 +725,55 @@
           <w:b w:val="0"/>
           <w:sz w:val="21"/>
         </w:rPr>
-        <w:t>[9] Efron B. Bootstrap methods: another look at the jackknife. Ann Statist. 1979;7:1–26. https://doi.org/10.1214/aos/1176344552.</w:t>
+        <w:t>[9] Geng Z, Wafula E, Corbett RJ, et al. The Open Pediatric Cancer Project. GigaScience. 2025;14:giaf093. https://doi.org/10.1093/gigascience/giaf093.</w:t>
+      </w:r>
+    </w:p>
+    <w:p>
+      <w:pPr>
+        <w:spacing w:line="252" w:lineRule="auto" w:after="140"/>
+      </w:pPr>
+      <w:r>
+        <w:rPr>
+          <w:b w:val="0"/>
+          <w:sz w:val="21"/>
+        </w:rPr>
+        <w:t>[10] Efron B. Bootstrap methods: another look at the jackknife. Ann Statist. 1979;7:1–26. https://doi.org/10.1214/aos/1176344552.</w:t>
+      </w:r>
+    </w:p>
+    <w:p>
+      <w:pPr>
+        <w:spacing w:line="252" w:lineRule="auto" w:after="140"/>
+      </w:pPr>
+      <w:r>
+        <w:rPr>
+          <w:b w:val="0"/>
+          <w:sz w:val="21"/>
+        </w:rPr>
+        <w:t>[11] Wang X, Osada T, Wang Y, Yu L, Sakakura K, Katayama A, et al. CSPG4 protein as a new target for the antibody-based immunotherapy of triple-negative breast cancer. J Natl Cancer Inst. 2010;102:1496–1512. https://doi.org/10.1093/jnci/djq343.</w:t>
+      </w:r>
+    </w:p>
+    <w:p>
+      <w:pPr>
+        <w:spacing w:line="252" w:lineRule="auto" w:after="140"/>
+      </w:pPr>
+      <w:r>
+        <w:rPr>
+          <w:b w:val="0"/>
+          <w:sz w:val="21"/>
+        </w:rPr>
+        <w:t>[12] Leuci V, Donini C, Grignani G, Rotolo R, Mesiano G, Fiorino E, et al. CSPG4-Specific CAR.CIK Lymphocytes as a Novel Therapy for the Treatment of Multiple Soft-Tissue Sarcoma Histotypes. Clin Cancer Res. 2020;26:6321–6334. https://doi.org/10.1158/1078-0432.CCR-20-0357.</w:t>
+      </w:r>
+    </w:p>
+    <w:p>
+      <w:pPr>
+        <w:spacing w:line="252" w:lineRule="auto" w:after="140"/>
+      </w:pPr>
+      <w:r>
+        <w:rPr>
+          <w:b w:val="0"/>
+          <w:sz w:val="21"/>
+        </w:rPr>
+        <w:t>[13] National Cancer Institute. iC9-CAR.CSPG4 T-Cells for the Treatment of Patients with Recurrent or Refractory Head and Neck Squamous Cell Carcinoma. NCT06096038; NCI-2024-01228. https://www.cancer.gov/research/participate/clinical-trials-search/v?id=NCI-2024-01228. Accessed 22 September 2026.</w:t>
       </w:r>
     </w:p>
     <w:p>

</xml_diff>

<commit_message>
Clarify CSPG4 selection and exclusions; add all-primary sensitivity and simplify presentation
</commit_message>
<xml_diff>
--- a/research/release-candidates/cspg4-concise-20260922/journal-package/CSPG4-manuscript.docx
+++ b/research/release-candidates/cspg4-concise-20260922/journal-package/CSPG4-manuscript.docx
@@ -111,7 +111,7 @@
           <w:b w:val="0"/>
           <w:sz w:val="22"/>
         </w:rPr>
-        <w:t xml:space="preserve"> An exploratory analysis of a fixed 11-gene panel compared nine EMC specimens with 393 other specimens from 28 source-defined malignant tumor categories in one RNA-sequencing cohort. All 644 eligible specimens, including other tumor categories, remained in the descriptive atlas. Analysis used an exact rank-sum permutation test with Bonferroni correction for 11 genes, evaluated the array comparisons, and characterized additional public collections separately by source and measurement scale.</w:t>
+        <w:t xml:space="preserve"> An exploratory analysis of a curated 11-gene panel compared nine EMC specimens with 393 other specimens from 28 source-defined malignant tumor categories in one RNA-sequencing cohort. All 644 eligible specimens, including other tumor categories, remained in the descriptive atlas. Analysis used an exact rank-sum permutation test with Bonferroni correction for 11 genes, evaluated the array comparisons, and characterized additional public collections separately by source and measurement scale.</w:t>
       </w:r>
     </w:p>
     <w:p>
@@ -215,7 +215,7 @@
         <w:rPr>
           <w:b w:val="0"/>
         </w:rPr>
-        <w:t>The initial analysis compared RNA expression of 11 genes encoding candidate therapeutic antigens in EMC and selected sarcoma comparators. CSPG4 alone met the fixed prioritization rule across myxoid liposarcoma, low-grade fibromyxoid sarcoma and synovial sarcoma. Its higher expression relative to low-grade fibromyxoid sarcoma also recurred in a separate array collection. These findings motivated the broader question addressed here: where does EMC lie within the range of CSPG4 expression across sarcoma types?</w:t>
+        <w:t>CSPG4 emerged from an exploratory assessment of 11 candidate therapeutic targets in EMC. Its RNA expression was higher than in three selected sarcoma comparators—myxoid liposarcoma, low-grade fibromyxoid sarcoma (LGFMS) and synovial sarcoma—and the contrast with low-grade fibromyxoid sarcoma recurred in an array collection. These observations motivated a broader question: where does EMC lie within the range of CSPG4 expression across sarcoma types?</w:t>
       </w:r>
     </w:p>
     <w:p>
@@ -231,7 +231,7 @@
         <w:rPr>
           <w:b w:val="0"/>
         </w:rPr>
-        <w:t>The present study compares EMC with a broader sarcoma reference, examines contrasts shared across assays and describes additional public collections separately by source. Together, these analyses show which expression differences recur and which depend on the chosen comparator.</w:t>
+        <w:t>The present study places EMC within a source atlas of 60 diagnosis labels, spanning malignant, intermediate and benign soft-tissue tumors and related contexts. Broad sarcoma references and contrasts shared across assays establish the comparative framework; additional public collections describe the wider CSPG4 landscape.</w:t>
       </w:r>
     </w:p>
     <w:p>
@@ -243,11 +243,11 @@
       </w:r>
     </w:p>
     <w:p>
-      <w:pPr>
-        <w:pStyle w:val="Heading2"/>
-      </w:pPr>
       <w:r>
-        <w:t>Study design and reference groups</w:t>
+        <w:rPr>
+          <w:b w:val="0"/>
+        </w:rPr>
+        <w:t>The 11 genes—CD276, SSTR2, PRAME, FAP, CD248, CSPG4, MSLN, L1CAM, GPC3, ALPP and CDH17—were a manually curated working list of candidate therapeutic targets. The list combined cell-surface antigens, stromal targets and the intracellular peptide–HLA candidate PRAME. It was a hypothesis-driven subset, rather than the top 11 genes from a genome-wide screen. All 11 were measured and retained. The initial myxoid liposarcoma, LGFMS and synovial sarcoma comparisons were investigator-selected for morphological and diagnostic relevance; the broader analysis included every category meeting the criteria below. Supplementary Information gives panel provenance and the original prioritization rule.</w:t>
       </w:r>
     </w:p>
     <w:p>
@@ -255,7 +255,7 @@
         <w:rPr>
           <w:b w:val="0"/>
         </w:rPr>
-        <w:t>CSPG4 was evaluated within a fixed panel of 11 genes: CD276, SSTR2, PRAME, FAP, CD248, CSPG4, MSLN, L1CAM, GPC3, ALPP and CDH17. The broader reference and uncertainty analyses were specified after the initial comparator-specific results were known. Supplementary Information describes the analysis chronology, specimen exclusions, probe mappings and comparator-specific decision rule.</w:t>
+        <w:t>The Hofvander collection provides gene-level transcripts per million (TPM), original diagnoses and specimen metadata.[4] A consistent primary-lesion definition excluded specimens flagged as recurrent or metastatic across all histologies. This removed one local recurrence from the 13 source EMC specimens. Three further EMC patients were identified in the historical array cohort through published case identifiers and excluded to reduce overlap between assays, leaving nine. These three are valid primary tumors; a sensitivity analysis included all 12 source-primary EMCs against the same references. The supplement identifies each exclusion and its evidence. Among the retained nine, source records specify seven NR4A3 fusions, one FUS::NR4A2 fusion and one fusion-positive case without a crosswalked fusion identity (Table S6); membership follows the source diagnosis.</w:t>
       </w:r>
     </w:p>
     <w:p>
@@ -263,7 +263,7 @@
         <w:rPr>
           <w:b w:val="0"/>
         </w:rPr>
-        <w:t>The Hofvander collection provides gene-level transcripts per million (TPM), original diagnoses and specimen metadata.[4] Eligibility followed the original diagnoses and excluded specimens with a nonblank recurrence or metastasis flag. Of 13 source EMC specimens, three previously reported cases and one local recurrence were excluded, leaving nine. Source Table S1 marked all nine as fusion-positive. Filtered fusion records specify seven NR4A3 fusions, one RT-PCR-verified FUS::NR4A2 fusion and no crosswalked fusion for the remaining specimen (Table S6). Membership follows the source EMC diagnosis.</w:t>
+        <w:t>The retained atlas contains 644 specimens across 60 original diagnosis labels. The primary reference uses all 393 non-EMC specimens from 28 categories classified as Malignant by the source, excluding melanoma, a non-sarcoma context, and unclassified spindle-cell tumors, which lack a specific histologic identity. A broader reference includes all 96 eligible specimens from nine source-classified Intermediate categories, giving 489 references across 37 labels. These are source behavior labels: gastrointestinal stromal tumor (GIST), dermatofibrosarcoma protuberans (DFSP) and solitary fibrous tumor (SFT) fall in the Intermediate category in this dataset. The broader analysis tests how this classification boundary affects the EMC comparison. All other eligible categories remain in the descriptive atlas.</w:t>
       </w:r>
     </w:p>
     <w:p>
@@ -271,7 +271,7 @@
         <w:rPr>
           <w:b w:val="0"/>
         </w:rPr>
-        <w:t>The retained collection contains 644 specimens across 60 original diagnosis labels. The primary reference comprises 393 non-EMC specimens from 28 categories classified as Malignant by the source, excluding melanoma and unclassified spindle-cell tumors. A broader reference adds 96 specimens from nine Intermediate categories, including gastrointestinal stromal tumor (GIST) and dermatofibrosarcoma protuberans (DFSP), for 489 references across 37 labels. All eligible specimens remain in the descriptive atlas.</w:t>
+        <w:t>GSE24369 provides six EMC biopsies, 17 LGFMS, six myxofibrosarcomas (MFS), six desmoids, five SFT and two pooled muscle RNAs.[5] Array analysis retained the released GPL6244 robust multi-array average log2 signals and CSPG4 transcript cluster 7990545. Lesion stage was not established. LGFMS, MFS, desmoid and SFT were compared because they are the tumor groups shared with the RNA-sequencing collection. Comparisons used each dataset’s own measurement scale.</w:t>
       </w:r>
     </w:p>
     <w:p>
@@ -279,15 +279,7 @@
         <w:rPr>
           <w:b w:val="0"/>
         </w:rPr>
-        <w:t>GSE24369 provides six EMC biopsies, 17 low-grade fibromyxoid sarcomas (LGFMS), six myxofibrosarcomas (MFS), six desmoids, five solitary fibrous tumors (SFT) and two pooled muscle RNAs.[5] Array analysis retained the released GPL6244 robust multi-array average log2 signals and CSPG4 transcript cluster 7990545. Lesion stage was not established. Comparisons were calculated within each dataset, keeping TPM and array signals separate.</w:t>
-      </w:r>
-    </w:p>
-    <w:p>
-      <w:pPr>
-        <w:pStyle w:val="Heading2"/>
-      </w:pPr>
-      <w:r>
-        <w:t>Additional public collections</w:t>
+        <w:t>The source search examined public sarcoma compendia, their original accessions and identifiable EMC-containing studies. Records required a usable CSPG4 measurement and traceable diagnosis. Each collection retained its source-specific measurement scale: Treehouse Tumor Compendium 25.01 log2(TPM+1), Boudin et al. published normalized log2 values, GSE213065 Salmon TPM, GSE234092 featureCounts-derived counts per million (CPM), and OpenPedCan v15 gene TPM.[3,6,7,8,9] The supplement lists unresolved or inaccessible EMC sources.</w:t>
       </w:r>
     </w:p>
     <w:p>
@@ -295,7 +287,7 @@
         <w:rPr>
           <w:b w:val="0"/>
         </w:rPr>
-        <w:t>The source search, completed on 19 September, examined public sarcoma compendia, their original accessions and identifiable EMC-containing studies. Records required a usable CSPG4 measurement and traceable diagnosis. Each collection retained its source-specific measurement scale: Treehouse Tumor Compendium 25.01 log2(TPM+1), Boudin et al. published normalized log2 values, GSE213065 Salmon TPM, GSE234092 featureCounts-derived counts per million (CPM), and OpenPedCan v15 gene TPM.[3,6,7,8,9] The supplement lists unresolved or inaccessible EMC sources.</w:t>
+        <w:t>Selection used diagnosis and identity metadata. Within each resource, donor identifiers, specimen aliases and explicit patient IDs guided retention of one eligible profile per supported identity. Known reuse across Treehouse, Boudin and OpenPedCan was removed; unresolved identities remain qualified in the supplied ledgers. Library-method and original-study strata were retained. Counts describe profiles within resources, not a globally unique patient cohort.</w:t>
       </w:r>
     </w:p>
     <w:p>
@@ -303,15 +295,7 @@
         <w:rPr>
           <w:b w:val="0"/>
         </w:rPr>
-        <w:t>Selection used diagnosis and identity metadata rather than CSPG4 values. Treehouse profiles were grouped by donor identifier or conservative specimen prefix; Boudin records were joined to original GEO metadata. TCGA records already represented in Treehouse were omitted from Boudin summaries. GSE213065 contributed one earliest-timepoint T1a profile per explicit patient ID; GSE234092 retained its 69 repository records as a separately defined collection. OpenPedCan used independent-specimen lists, excluded known Treehouse donor aliases and kept one provenance-uncertain parental tumor outside clinical summaries. Analyses retained library-method and original-source strata. Counts describe profiles within resources, not a globally unique patient cohort; detailed selection and overlap ledgers are supplied.</w:t>
-      </w:r>
-    </w:p>
-    <w:p>
-      <w:pPr>
-        <w:pStyle w:val="Heading2"/>
-      </w:pPr>
-      <w:r>
-        <w:t>Statistical analysis</w:t>
+        <w:t>Expression summaries included medians, quartiles and ranges. The comparison score A averages every EMC–reference specimen pair, assigning 1 when EMC expression is higher, 0.5 when equal and 0 when lower; A=0.5 denotes neutral ordering. The primary estimate weights reference specimens equally. Sensitivity analyses averaged the category-specific scores to give each reference category equal weight and examined deletion of individual EMC specimens.</w:t>
       </w:r>
     </w:p>
     <w:p>
@@ -319,7 +303,7 @@
         <w:rPr>
           <w:b w:val="0"/>
         </w:rPr>
-        <w:t>Expression summaries included medians, quartiles and ranges. The comparison score A=P(EMC&gt;reference)+0.5P(tie) averages all specimen pairs; A=0.5 denotes neutral ordering. The primary estimate weights reference specimens equally. Sensitivity analyses averaged the category-specific scores to give each reference category equal weight and examined deletion of individual EMC specimens.</w:t>
+        <w:t>The primary test used the exact rank-sum distribution for every allocation of nine EMC labels among 402 observations. Equal expression values received their average rank and remained separate observations in the permutation distribution. Its two-sided tail includes sums at least as far from the null expectation as the observed sum. This tests an exchangeable-label, common-distribution null for the observational groups. Bonferroni correction covers the retained 11 genes. Approximate 95% percentile bootstrap intervals for both references used 50,000 independent resamples of specimens within each group at its original size, seed 20260921, with linear-interpolation quantiles.[10]</w:t>
       </w:r>
     </w:p>
     <w:p>
@@ -327,15 +311,7 @@
         <w:rPr>
           <w:b w:val="0"/>
         </w:rPr>
-        <w:t>The primary test used the exact rank-sum distribution for every allocation of nine EMC labels among 402 observations, preserving ties. Its two-sided tail includes sums at least as far from the null expectation as the observed sum. This tests an exchangeable-label, common-distribution null for the observational groups. Bonferroni correction covers the retained 11 genes. Approximate 95% percentile bootstrap intervals for both references used 50,000 independent resamples of specimens within each group at its original size, seed 20260921, with linear-interpolation quantiles.[10] No new hypothesis test was added for the broader reference.</w:t>
-      </w:r>
-    </w:p>
-    <w:p>
-      <w:r>
-        <w:rPr>
-          <w:b w:val="0"/>
-        </w:rPr>
-        <w:t>Comparator-specific and sequencing-year-conditioned analyses were evaluated as sensitivities. External summaries and pairwise A values were calculated within designated source strata. Cross-source descriptive ranges included only within-source contrasts with at least five profiles per diagnosis in each contributing stratum. External measurements were not pooled, and no external P values were calculated. Code, source digests, selection ledgers and complete results accompany the data archive.</w:t>
+        <w:t>The broader reference and the all-12-EMC sensitivity were summarized descriptively. External summaries and pairwise A values were calculated within designated source strata. Cross-source descriptive ranges included only within-source contrasts with at least five profiles per diagnosis in each contributing stratum. Code, source digests, selection ledgers and complete results accompany the data archive.</w:t>
       </w:r>
     </w:p>
     <w:p>
@@ -347,19 +323,11 @@
       </w:r>
     </w:p>
     <w:p>
-      <w:pPr>
-        <w:pStyle w:val="Heading2"/>
-      </w:pPr>
-      <w:r>
-        <w:t>EMC within the broader reference</w:t>
-      </w:r>
-    </w:p>
-    <w:p>
       <w:r>
         <w:rPr>
           <w:b w:val="0"/>
         </w:rPr>
-        <w:t>Median CSPG4 was 54.18 TPM in the nine EMC specimens, with an interquartile range of 41.41–63.98 and a range of 10.14–207.08 TPM. The primary reference median was 11.87 TPM. The specimen-weighted A was 0.846 (approximate 95% bootstrap interval 0.709–0.958), with exact two-sided P=0.000130435 and Bonferroni-11 P=0.00143479. Equal weighting of reference categories gave A=0.866. Deleting any one EMC specimen left A between 0.828 and 0.894.</w:t>
+        <w:t>Median CSPG4 was 54.18 TPM in the nine EMC specimens, with an interquartile range of 41.41–63.98 and a range of 10.14–207.08 TPM. The primary reference median was 11.87 TPM. The specimen-weighted A was 0.846 (approximate 95% bootstrap interval 0.709–0.958), with exact two-sided P=0.000130435 and Bonferroni-11 P=0.00143479. Equal weighting of reference categories gave A=0.866. Deleting any one EMC specimen left A between 0.828 and 0.894. Including the three primary EMCs overlapping the array cohort gave a 12-specimen median of 51.21 TPM and A=0.808 against the same primary reference; A was 0.785 against the broader reference.</w:t>
       </w:r>
     </w:p>
     <w:p>
@@ -375,15 +343,7 @@
         <w:rPr>
           <w:b w:val="0"/>
         </w:rPr>
-        <w:t>MSLN also had higher ordering against the primary reference (A=0.811; adjusted P=0.00406), while several panel genes had lower ordering. Table S2 reports all 11 genes. These pooled comparisons answer a different question from the original comparator-specific rule, which CSPG4 alone satisfied.</w:t>
-      </w:r>
-    </w:p>
-    <w:p>
-      <w:pPr>
-        <w:pStyle w:val="Heading2"/>
-      </w:pPr>
-      <w:r>
-        <w:t>Direct comparisons across assays</w:t>
+        <w:t>MSLN also had higher ordering against the primary reference (A=0.811; adjusted P=0.00406), while several panel genes had lower ordering. Table S2 reports all 11 genes. The original three-comparator panel results and historical sensitivity analyses are supplied in the supplement.</w:t>
       </w:r>
     </w:p>
     <w:p>
@@ -392,14 +352,6 @@
           <w:b w:val="0"/>
         </w:rPr>
         <w:t>CSPG4 was higher in EMC than LGFMS in both the six-EMC versus 17-LGFMS array comparison (A=1.000) and the nine-EMC versus 13-LGFMS RNA-sequencing comparison (A=0.966; Figure 2). Deleting any one EMC or LGFMS array biopsy retained A=1.000. Array scores against MFS, SFT and desmoid were also 1.000; corresponding RNA-sequencing scores were 0.854, 0.879 and 1.000. DFSP supplied a contrary RNA-sequencing comparison (A=0.467).</w:t>
-      </w:r>
-    </w:p>
-    <w:p>
-      <w:pPr>
-        <w:pStyle w:val="Heading2"/>
-      </w:pPr>
-      <w:r>
-        <w:t>Patterns in additional collections</w:t>
       </w:r>
     </w:p>
     <w:p>
@@ -416,22 +368,6 @@
           <w:b w:val="0"/>
         </w:rPr>
         <w:t>Some relative patterns recurred across sources (Figure S2). MFS was lower than leiomyosarcoma (LMS) in all six strata with at least five profiles per group, with A=P(MFS&gt;LMS)+0.5P(tie) ranging from 0.182 to 0.246. Undifferentiated pleomorphic sarcoma was lower than LMS in all five supported strata (A=0.077–0.414). Other comparisons varied: dedifferentiated liposarcoma had A=0.173–0.343 against LMS in four strata but 0.517 in the Nakayama cohort. GIST had A=0.836 against LMS in GSE234092 and 0.502 in Treehouse-processed SRP057793. The complete tables retain each comparison's source, scale and specimen counts.</w:t>
-      </w:r>
-    </w:p>
-    <w:p>
-      <w:pPr>
-        <w:pStyle w:val="Heading2"/>
-      </w:pPr>
-      <w:r>
-        <w:t>Less favorable conditional sensitivities</w:t>
-      </w:r>
-    </w:p>
-    <w:p>
-      <w:r>
-        <w:rPr>
-          <w:b w:val="0"/>
-        </w:rPr>
-        <w:t>The original three-histology CSPG4 composite was 0.89454 across all years and 0.81111 when conditioned on sequencing year. Only four distinct EMC patients supported the latter. Removing the 2019 sample group left two matchable EMC patients and a conditional score of 0.43333, while the all-year score remained 0.83333. The expanded-reference year-conditioned sensitivity gave P=0.02064 and adjusted P=0.22704, using a different statistic and 319 supported-year references. These sensitivities change the supporting patients and comparison sets; they do not establish a sequencing-year effect. Full conditional results and the separate CHRNA6, normal-tissue and PRAME evidence are retained in the supplement.</w:t>
       </w:r>
     </w:p>
     <w:p>
@@ -471,7 +407,7 @@
         <w:rPr>
           <w:b w:val="0"/>
         </w:rPr>
-        <w:t>The nine EMC specimens remain the main limit on precision, reflected in the wide bootstrap intervals. Small comparison groups also make median rankings uncertain. The references reflect source classifications and sampling rather than population incidence or a comprehensive clinical taxonomy. Equal-category estimates change the weights but retain this dependence. The broader exploratory comparison followed the identification of CSPG4 as a gene of interest. Correction for 11 genes addresses that family of tests; retrospective selection and unmeasured confounding remain outside both that correction and the approximate bootstrap intervals.</w:t>
+        <w:t>The small EMC group remains the main limit on precision, reflected in the wide bootstrap intervals. Including the three overlapping primary cases attenuated the comparison, showing the effect of the overlap-reduction policy. Small comparison groups also make median rankings uncertain. The references reflect source classifications and sampling rather than population incidence or a comprehensive clinical taxonomy. Equal-category estimates change the weights but retain this dependence. This is an exploratory analysis of a curated gene panel. Gene selection and unmeasured confounding remain outside the 11-test correction and approximate bootstrap intervals.</w:t>
       </w:r>
     </w:p>
     <w:p>
@@ -479,7 +415,7 @@
         <w:rPr>
           <w:b w:val="0"/>
         </w:rPr>
-        <w:t>Incomplete specimen identities, clinical histories and historical overlap further limit interpretation. Assays and collections differ in quantification, library construction, disease stage and tissue composition, so cross-source measurements were kept separate. Uniform computational processing alone does not make them directly comparable. Array lesion stage and independence from historical collections remain incompletely established. The bounded source search and unresolved collections are documented in the supplement.</w:t>
+        <w:t>Incomplete specimen identities, clinical histories and historical overlap further limit interpretation. Assays and collections differ in quantification, library construction, disease stage and tissue composition, so cross-source measurements were kept separate. Uniform computational processing alone does not make them directly comparable. The known shared patients were excluded from the nine-case comparison, but incomplete array identifiers leave further historical overlap unresolved. The bounded source search and unresolved collections are documented in the supplement.</w:t>
       </w:r>
     </w:p>
     <w:p>
@@ -514,7 +450,7 @@
         <w:rPr>
           <w:b w:val="0"/>
         </w:rPr>
-        <w:t xml:space="preserve"> The original Hofvander data are available through https://doi.org/10.5281/zenodo.17866629. Original array data and annotations are available as GEO GSE24369 and GPL6244. Additional inputs are Treehouse Tumor Compendium 25.01, Boudin et al. Supplementary Table S8, GEO GSE213065 and GSE234092, and OpenPedCan v15. The data and code package, including exact source URLs, selection ledgers, digests and specimen values, is available at https://github.com/trimcrae/Rare-cancers/blob/14fea9109d7f329fe9319f1af58560707c938027/research/release-candidates/cspg4-concise-20260922/journal-package/CSPG4-data-code.zip. Source-specific attribution and reuse terms continue to apply.</w:t>
+        <w:t xml:space="preserve"> The original Hofvander data are available through https://doi.org/10.5281/zenodo.17866629. Original array data and annotations are available as GEO GSE24369 and GPL6244. Additional inputs are Treehouse Tumor Compendium 25.01, Boudin et al. Supplementary Table S8, GEO GSE213065 and GSE234092, and OpenPedCan v15. The data and code package, including exact source URLs, selection ledgers, digests and specimen values, is available at https://github.com/trimcrae/Rare-cancers/blob/facdeae6b4ade1e79f1e7892f71d8c486013e9bb/research/release-candidates/cspg4-concise-20260922/journal-package/CSPG4-data-code.zip. Source-specific attribution and reuse terms continue to apply.</w:t>
       </w:r>
     </w:p>
     <w:p>
@@ -795,7 +731,7 @@
       <w:r>
         <w:drawing>
           <wp:inline xmlns:a="http://schemas.openxmlformats.org/drawingml/2006/main" xmlns:pic="http://schemas.openxmlformats.org/drawingml/2006/picture">
-            <wp:extent cx="8686800" cy="5646570"/>
+            <wp:extent cx="8686800" cy="5754294"/>
             <wp:docPr id="1" name="Picture 1"/>
             <wp:cNvGraphicFramePr>
               <a:graphicFrameLocks noChangeAspect="1"/>
@@ -816,7 +752,7 @@
                   <pic:spPr>
                     <a:xfrm>
                       <a:off x="0" y="0"/>
-                      <a:ext cx="8686800" cy="5646570"/>
+                      <a:ext cx="8686800" cy="5754294"/>
                     </a:xfrm>
                     <a:prstGeom prst="rect"/>
                   </pic:spPr>
@@ -842,14 +778,14 @@
           <w:b/>
           <w:sz w:val="18"/>
         </w:rPr>
-        <w:t>Figure 1. CSPG4 RNA in EMC and the primary and broader references.</w:t>
+        <w:t>Figure 1. CSPG4 RNA across sarcoma and related tumor categories.</w:t>
       </w:r>
       <w:r>
         <w:rPr>
           <w:b w:val="0"/>
           <w:sz w:val="18"/>
         </w:rPr>
-        <w:t xml:space="preserve"> The 498 specimens span 38 source diagnosis labels: nine EMC (burgundy), 393 Malignant-category references (blue) and 96 additional Intermediate-category references (ochre). Dots show specimens, segments interquartile ranges and vertical marks medians. The axis uses log2(1+TPM) spacing with TPM labels; categories are ordered by observed median. Other eligible contexts appear in Figure S1. MIFS/HFLT, myxoinflammatory fibroblastic sarcoma/hemosiderotic fibrolipomatous tumor; NOS, not otherwise specified.</w:t>
+        <w:t xml:space="preserve"> The 498 specimens span 38 source diagnosis labels: nine EMC, 393 primary-reference specimens and 96 additional specimens marked by asterisks. Asterisks identify categories classified as Intermediate in the source; all other non-EMC rows form the Malignant-category reference. The broader reference includes both sets. Dots show specimens, horizontal segments interquartile ranges and vertical marks medians. The axis uses log2(1+TPM) spacing with TPM labels; categories are ordered by observed median. Other eligible contexts appear in Figure S1. MIFS/HFLT, myxoinflammatory fibroblastic sarcoma/hemosiderotic fibrolipomatous tumor; NOS, not otherwise specified.</w:t>
       </w:r>
     </w:p>
     <w:p>

</xml_diff>

<commit_message>
Report all13 recurrence sensitivity in concise CSPG4 manuscript and supplement
</commit_message>
<xml_diff>
--- a/research/release-candidates/cspg4-concise-20260922/journal-package/CSPG4-manuscript.docx
+++ b/research/release-candidates/cspg4-concise-20260922/journal-package/CSPG4-manuscript.docx
@@ -255,7 +255,7 @@
         <w:rPr>
           <w:b w:val="0"/>
         </w:rPr>
-        <w:t>The Hofvander collection provides gene-level transcripts per million (TPM), original diagnoses and specimen metadata.[4] A consistent primary-lesion definition excluded specimens flagged as recurrent or metastatic across all histologies. This removed one local recurrence from the 13 source EMC specimens. Three further EMC patients were identified in the historical array cohort through published case identifiers and excluded to reduce overlap between assays, leaving nine. These three are valid primary tumors; a sensitivity analysis included all 12 source-primary EMCs against the same references. The supplement identifies each exclusion and its evidence. Among the retained nine, source records specify seven NR4A3 fusions, one FUS::NR4A2 fusion and one fusion-positive case without a crosswalked fusion identity (Table S6); membership follows the source diagnosis.</w:t>
+        <w:t>The Hofvander collection provides gene-level transcripts per million (TPM), original diagnoses and specimen metadata.[4] A consistent primary-lesion definition excluded specimens flagged as recurrent or metastatic across all histologies. This removed one local recurrence from the 13 source EMC specimens. Three further EMC patients were identified in the historical array cohort through published case identifiers and excluded to reduce overlap between assays, leaving nine. Sensitivity analyses included all 12 source-primary EMCs and then all 13 source EMCs, including the local recurrence, against the same references. The supplement identifies each exclusion and its evidence. Among the retained nine, source records specify seven NR4A3 fusions, one FUS::NR4A2 fusion and one fusion-positive case without a crosswalked fusion identity (Table S6); membership follows the source diagnosis.</w:t>
       </w:r>
     </w:p>
     <w:p>
@@ -311,7 +311,7 @@
         <w:rPr>
           <w:b w:val="0"/>
         </w:rPr>
-        <w:t>The broader reference and the all-12-EMC sensitivity were summarized descriptively. External summaries and pairwise A values were calculated within designated source strata. Cross-source descriptive ranges included only within-source contrasts with at least five profiles per diagnosis in each contributing stratum. Code, source digests, selection ledgers and complete results accompany the data archive.</w:t>
+        <w:t>The broader reference and the 12- and 13-specimen EMC sensitivities were summarized descriptively. External summaries and pairwise A values were calculated within designated source strata. Cross-source descriptive ranges included only within-source contrasts with at least five profiles per diagnosis in each contributing stratum. Code, source digests, selection ledgers and complete results accompany the data archive.</w:t>
       </w:r>
     </w:p>
     <w:p>
@@ -327,7 +327,7 @@
         <w:rPr>
           <w:b w:val="0"/>
         </w:rPr>
-        <w:t>Median CSPG4 was 54.18 TPM in the nine EMC specimens, with an interquartile range of 41.41–63.98 and a range of 10.14–207.08 TPM. The primary reference median was 11.87 TPM. The specimen-weighted A was 0.846 (approximate 95% bootstrap interval 0.709–0.958), with exact two-sided P=0.000130435 and Bonferroni-11 P=0.00143479. Equal weighting of reference categories gave A=0.866. Deleting any one EMC specimen left A between 0.828 and 0.894. Including the three primary EMCs overlapping the array cohort gave a 12-specimen median of 51.21 TPM and A=0.808 against the same primary reference; A was 0.785 against the broader reference.</w:t>
+        <w:t>Median CSPG4 was 54.18 TPM in the nine EMC specimens, with an interquartile range of 41.41–63.98 and a range of 10.14–207.08 TPM. The primary reference median was 11.87 TPM. The specimen-weighted A was 0.846 (approximate 95% bootstrap interval 0.709–0.958), with exact two-sided P=0.000130435 and Bonferroni-11 P=0.00143479. Equal weighting of reference categories gave A=0.866. Deleting any one EMC specimen left A between 0.828 and 0.894. Including all 12 primary EMCs gave a median of 51.21 TPM and A=0.808 and 0.785 against the primary and broader references, respectively. Including the local recurrence (all 13 EMCs) gave a median of 48.92 TPM and corresponding scores of 0.809 and 0.784.</w:t>
       </w:r>
     </w:p>
     <w:p>
@@ -407,7 +407,7 @@
         <w:rPr>
           <w:b w:val="0"/>
         </w:rPr>
-        <w:t>The small EMC group remains the main limit on precision, reflected in the wide bootstrap intervals. Including the three overlapping primary cases attenuated the comparison, showing the effect of the overlap-reduction policy. Small comparison groups also make median rankings uncertain. The references reflect source classifications and sampling rather than population incidence or a comprehensive clinical taxonomy. Equal-category estimates change the weights but retain this dependence. This is an exploratory analysis of a curated gene panel. Gene selection and unmeasured confounding remain outside the 11-test correction and approximate bootstrap intervals.</w:t>
+        <w:t>The small EMC group remains the main limit on precision, reflected in the wide bootstrap intervals. Including the three overlapping primary cases attenuated the comparison; adding the local recurrence had little further effect on the comparison scores. Small comparison groups also make median rankings uncertain. The references reflect source classifications and sampling rather than population incidence or a comprehensive clinical taxonomy. Equal-category estimates change the weights but retain this dependence. This is an exploratory analysis of a curated gene panel. Gene selection and unmeasured confounding remain outside the 11-test correction and approximate bootstrap intervals.</w:t>
       </w:r>
     </w:p>
     <w:p>
@@ -450,7 +450,7 @@
         <w:rPr>
           <w:b w:val="0"/>
         </w:rPr>
-        <w:t xml:space="preserve"> The original Hofvander data are available through https://doi.org/10.5281/zenodo.17866629. Original array data and annotations are available as GEO GSE24369 and GPL6244. Additional inputs are Treehouse Tumor Compendium 25.01, Boudin et al. Supplementary Table S8, GEO GSE213065 and GSE234092, and OpenPedCan v15. The data and code package, including exact source URLs, selection ledgers, digests and specimen values, is available at https://github.com/trimcrae/Rare-cancers/blob/facdeae6b4ade1e79f1e7892f71d8c486013e9bb/research/release-candidates/cspg4-concise-20260922/journal-package/CSPG4-data-code.zip. Source-specific attribution and reuse terms continue to apply.</w:t>
+        <w:t xml:space="preserve"> The original Hofvander data are available through https://doi.org/10.5281/zenodo.17866629. Original array data and annotations are available as GEO GSE24369 and GPL6244. Additional inputs are Treehouse Tumor Compendium 25.01, Boudin et al. Supplementary Table S8, GEO GSE213065 and GSE234092, and OpenPedCan v15. The data and code package, including exact source URLs, selection ledgers, digests and specimen values, is available at https://github.com/trimcrae/Rare-cancers/blob/d690cc9dca71debee5fcbb871924862d27bf9397/research/release-candidates/cspg4-concise-20260922/journal-package/CSPG4-data-code.zip. Source-specific attribution and reuse terms continue to apply.</w:t>
       </w:r>
     </w:p>
     <w:p>

</xml_diff>

<commit_message>
Audit CSPG4 references and correct source attribution and model-specific claims
</commit_message>
<xml_diff>
--- a/research/release-candidates/cspg4-concise-20260922/journal-package/CSPG4-manuscript.docx
+++ b/research/release-candidates/cspg4-concise-20260922/journal-package/CSPG4-manuscript.docx
@@ -391,7 +391,7 @@
         <w:rPr>
           <w:b w:val="0"/>
         </w:rPr>
-        <w:t>CSPG4 is already being investigated as a therapeutic target. A CSPG4-directed antibody inhibited tumor growth and metastasis in mouse models of triple-negative breast cancer.[11] In sarcoma models, cytokine-induced killer cells carrying a CSPG4-directed chimeric antigen receptor (CAR) showed activity in culture and in xenografts of leiomyosarcoma, undifferentiated pleomorphic sarcoma and fibrosarcoma.[12] A CSPG4-directed CAR-T approach has also entered phase I testing in recurrent or refractory head-and-neck squamous-cell carcinoma (NCT06096038), with safety and tolerability as the primary objective.[13] These studies place the EMC expression finding within an existing experimental targeting field, without establishing a treatment for EMC.</w:t>
+        <w:t>CSPG4 is already being investigated as a therapeutic target. A CSPG4-directed antibody inhibited breast-cancer cell growth in culture and reduced experimental lung metastases in mice.[11] In sarcoma models, cytokine-induced killer cells carrying a CSPG4-directed chimeric antigen receptor (CAR) showed activity in culture and in xenografts of leiomyosarcoma, undifferentiated pleomorphic sarcoma and fibrosarcoma.[12] A CSPG4-directed CAR-T approach has also entered phase I testing in recurrent or refractory head-and-neck squamous-cell carcinoma (NCT06096038), with safety and tolerability as the primary objective.[13] These studies place the EMC expression finding within an existing experimental targeting field, without establishing a treatment for EMC.</w:t>
       </w:r>
     </w:p>
     <w:p>
@@ -450,7 +450,7 @@
         <w:rPr>
           <w:b w:val="0"/>
         </w:rPr>
-        <w:t xml:space="preserve"> The original Hofvander data are available through https://doi.org/10.5281/zenodo.17866629. Original array data and annotations are available as GEO GSE24369 and GPL6244. Additional inputs are Treehouse Tumor Compendium 25.01, Boudin et al. Supplementary Table S8, GEO GSE213065 and GSE234092, and OpenPedCan v15. The data and code package, including exact source URLs, selection ledgers, digests and specimen values, is available at https://github.com/trimcrae/Rare-cancers/blob/d690cc9dca71debee5fcbb871924862d27bf9397/research/release-candidates/cspg4-concise-20260922/journal-package/CSPG4-data-code.zip. Source-specific attribution and reuse terms continue to apply.</w:t>
+        <w:t xml:space="preserve"> The original Hofvander data are available through https://doi.org/10.5281/zenodo.17866629. Original array data and annotations are available as GEO GSE24369 (https://www.ncbi.nlm.nih.gov/geo/query/acc.cgi?acc=GSE24369) and GPL6244 (https://www.ncbi.nlm.nih.gov/geo/query/acc.cgi?acc=GPL6244). Additional inputs are Treehouse Tumor Compendium 25.01, Boudin et al. Supplementary Table S8, GEO GSE213065 and GSE234092, and OpenPedCan v15. The data and code package, including exact source URLs, selection ledgers, digests and specimen values, is available at https://github.com/trimcrae/Rare-cancers/blob/d690cc9dca71debee5fcbb871924862d27bf9397/research/release-candidates/cspg4-concise-20260922/journal-package/CSPG4-data-code.zip. Source-specific attribution and reuse terms continue to apply.</w:t>
       </w:r>
     </w:p>
     <w:p>
@@ -613,7 +613,7 @@
           <w:b w:val="0"/>
           <w:sz w:val="21"/>
         </w:rPr>
-        <w:t>[5] National Center for Biotechnology Information. GEO series GSE24369 and platform GPL6244. https://www.ncbi.nlm.nih.gov/geo/query/acc.cgi?acc=GSE24369; https://www.ncbi.nlm.nih.gov/geo/query/acc.cgi?acc=GPL6244.</w:t>
+        <w:t>[5] Möller E, Hornick JL, Magnusson L, Veerla S, Domanski HA, Mertens F. FUS-CREB3L2/L1-positive sarcomas show a specific gene expression profile with upregulation of CD24 and FOXL1. Clin Cancer Res. 2011;17:2646–2656. https://doi.org/10.1158/1078-0432.CCR-11-0145.</w:t>
       </w:r>
     </w:p>
     <w:p>
@@ -625,7 +625,7 @@
           <w:b w:val="0"/>
           <w:sz w:val="21"/>
         </w:rPr>
-        <w:t>[6] Beale HC, Learned K, Kephart ET, et al. Consistently processed RNA sequencing data from 50 sources enriched for pediatric data. Sci Data. 2025;12:1134. https://doi.org/10.1038/s41597-025-05376-z.</w:t>
+        <w:t>[6] Beale HC, Learned K, Kephart ET, Lyle AG, van den Bout A, McCabe M, et al. Consistently processed RNA sequencing data from 50 sources enriched for pediatric data. Sci Data. 2025;12:1134. https://doi.org/10.1038/s41597-025-05376-z.</w:t>
       </w:r>
     </w:p>
     <w:p>
@@ -637,7 +637,7 @@
           <w:b w:val="0"/>
           <w:sz w:val="21"/>
         </w:rPr>
-        <w:t>[7] Subramanian A, Nemat-Gorgani N, Ellis-Caleo TJ, et al. Sarcoma microenvironment cell states and ecosystems are associated with prognosis and predict response to immunotherapy. Nat Cancer. 2024;5:642–658. https://doi.org/10.1038/s43018-024-00743-y.</w:t>
+        <w:t>[7] Subramanian A, Nemat-Gorgani N, Ellis-Caleo TJ, van IJzendoorn DGP, Sears TJ, Somani A, et al. Sarcoma microenvironment cell states and ecosystems are associated with prognosis and predict response to immunotherapy. Nat Cancer. 2024;5:642–658. https://doi.org/10.1038/s43018-024-00743-y.</w:t>
       </w:r>
     </w:p>
     <w:p>
@@ -649,7 +649,7 @@
           <w:b w:val="0"/>
           <w:sz w:val="21"/>
         </w:rPr>
-        <w:t>[8] Seligson ND, Asmann YW, Almerey T, et al. Molecular markers of proliferation, DNA repair, and immune infiltration defines high-risk subset of resectable retroperitoneal sarcomas. Surg Oncol. 2024;56:102125. https://doi.org/10.1016/j.suronc.2024.102125.</w:t>
+        <w:t>[8] Seligson ND, Asmann YW, Almerey T, Zayas YC, Edgar MA, Attia S, et al. Molecular markers of proliferation, DNA repair, and immune infiltration defines high-risk subset of resectable retroperitoneal sarcomas. Surg Oncol. 2024;56:102125. https://doi.org/10.1016/j.suronc.2024.102125.</w:t>
       </w:r>
     </w:p>
     <w:p>
@@ -661,7 +661,7 @@
           <w:b w:val="0"/>
           <w:sz w:val="21"/>
         </w:rPr>
-        <w:t>[9] Geng Z, Wafula E, Corbett RJ, et al. The Open Pediatric Cancer Project. GigaScience. 2025;14:giaf093. https://doi.org/10.1093/gigascience/giaf093.</w:t>
+        <w:t>[9] Geng Z, Wafula E, Corbett RJ, Zhang Y, Jin R, Gaonkar KS, et al. The Open Pediatric Cancer Project. GigaScience. 2025;14:giaf093. https://doi.org/10.1093/gigascience/giaf093.</w:t>
       </w:r>
     </w:p>
     <w:p>
@@ -673,7 +673,7 @@
           <w:b w:val="0"/>
           <w:sz w:val="21"/>
         </w:rPr>
-        <w:t>[10] Efron B. Bootstrap methods: another look at the jackknife. Ann Statist. 1979;7:1–26. https://doi.org/10.1214/aos/1176344552.</w:t>
+        <w:t>[10] Efron B. Better bootstrap confidence intervals. J Am Stat Assoc. 1987;82:171–185. https://doi.org/10.1080/01621459.1987.10478410.</w:t>
       </w:r>
     </w:p>
     <w:p>
@@ -709,7 +709,7 @@
           <w:b w:val="0"/>
           <w:sz w:val="21"/>
         </w:rPr>
-        <w:t>[13] National Cancer Institute. iC9-CAR.CSPG4 T-Cells for the Treatment of Patients with Recurrent or Refractory Head and Neck Squamous Cell Carcinoma. NCT06096038; NCI-2024-01228. https://www.cancer.gov/research/participate/clinical-trials-search/v?id=NCI-2024-01228. Accessed 22 September 2026.</w:t>
+        <w:t>[13] National Cancer Institute. iC9-CAR.CSPG4 T-Cells for the Treatment of Patients with Recurrent or Refractory Head and Neck Squamous Cell Carcinoma. NCT06096038; NCI-2024-01228. https://www.cancer.gov/research/participate/clinical-trials-search/v?id=NCI-2024-01228. Accessed 23 September 2026.</w:t>
       </w:r>
     </w:p>
     <w:p>

</xml_diff>